<commit_message>
feat(vacaciones): fecha de carta editable, vista previa y firma fiel en PDF
Documento interno (y copia de referencia, idénticas):
- "Santiago de Cali, mayo de 2026" -> marcador {FECHACARTA}
- {C.T} -> {SEDE}
- firma: de imagen flotante (anchor) a en línea, en su propio párrafo antes
  del nombre. Word se ve igual y el PDF deja de dañarla (docx-preview no
  reposiciona bien las imágenes ancladas; las inline sí son fieles).

Módulo:
- selector mes+año para {FECHACARTA} (pre-seleccionado al actual). Lo ajusta
  el usuario; NO viene del Excel ni del formulario, y queda excluido de los
  campos del registro individual y del aviso de columnas faltantes.
- vista previa de la carta (por fila, barra y plantilla) vía docx-preview en
  un iframe aislado.

Co-Authored-By: Claude Opus 4.8 <noreply@anthropic.com>
</commit_message>
<xml_diff>
--- a/docs/cartas/CARTA_DE_VACACIONES_JUNIO_2026.docx
+++ b/docs/cartas/CARTA_DE_VACACIONES_JUNIO_2026.docx
@@ -13,7 +13,7 @@
         <w:rPr>
           <w:lang w:val="es-ES"/>
         </w:rPr>
-        <w:t xml:space="preserve">Santiago de Cali, mayo de 2026 </w:t>
+        <w:t xml:space="preserve">Santiago de Cali, {FECHACARTA} </w:t>
       </w:r>
     </w:p>
     <w:p>
@@ -89,7 +89,7 @@
           <w:sz w:val="20"/>
           <w:szCs w:val="20"/>
         </w:rPr>
-        <w:t>{C.T}</w:t>
+        <w:t>{SEDE}</w:t>
       </w:r>
     </w:p>
     <w:p>
@@ -471,18 +471,14 @@
         </w:rPr>
       </w:pPr>
       <w:r>
+        <w:rPr>
+          <w:sz w:val="18"/>
+          <w:szCs w:val="18"/>
+        </w:rPr>
         <w:drawing>
-          <wp:anchor distT="0" distB="0" distL="0" distR="114300" simplePos="0" relativeHeight="3" behindDoc="0" locked="0" layoutInCell="0" allowOverlap="1">
-            <wp:simplePos x="0" y="0"/>
-            <wp:positionH relativeFrom="margin">
-              <wp:align>left</wp:align>
-            </wp:positionH>
-            <wp:positionV relativeFrom="paragraph">
-              <wp:posOffset>76200</wp:posOffset>
-            </wp:positionV>
+          <wp:inline distT="0" distB="0" distL="0" distR="0">
             <wp:extent cx="1704340" cy="662940"/>
             <wp:effectExtent l="0" t="0" r="0" b="0"/>
-            <wp:wrapSquare wrapText="bothSides"/>
             <wp:docPr id="1" name="Image1"/>
             <wp:cNvGraphicFramePr>
               <a:graphicFrameLocks xmlns:a="http://schemas.openxmlformats.org/drawingml/2006/main" noChangeAspect="1"/>
@@ -516,16 +512,18 @@
                 </pic:pic>
               </a:graphicData>
             </a:graphic>
-          </wp:anchor>
+          </wp:inline>
         </w:drawing>
       </w:r>
-      <w:r>
+    </w:p>
+    <w:p>
+      <w:pPr>
+        <w:pStyle w:val="BodyText"/>
         <w:rPr>
           <w:sz w:val="18"/>
           <w:szCs w:val="18"/>
         </w:rPr>
-        <w:br w:type="textWrapping" w:clear="all"/>
-      </w:r>
+      </w:pPr>
       <w:r>
         <w:rPr>
           <w:sz w:val="18"/>

</xml_diff>